<commit_message>
Add Feedback von Lehrperson
</commit_message>
<xml_diff>
--- a/Planungsdokumente/P1_G2_Themen-Planungsdokument_Luca_Kiril.docx
+++ b/Planungsdokumente/P1_G2_Themen-Planungsdokument_Luca_Kiril.docx
@@ -1315,17 +1315,17 @@
           </w:tcPr>
           <w:p>
             <w:r>
-              <w:t>Das Fahrzeug konsequent gekapselt, mit privatem Kilometerstand, Prüfung der gefahrenen Strecke und einem Zeitstempel als Folgeaktion. Danach den Code von KI gegenchecken lassen.</w:t>
-            </w:r>
-          </w:p>
-        </w:tc>
-        <w:tc>
-          <w:tcPr>
-            <w:tcW w:w="0" w:type="auto"/>
-          </w:tcPr>
-          <w:p>
-            <w:r>
-              <w:t>Der Kilometerstand kann jetzt nur noch wachsen. Ein öffentliches Feld hätte jeden Wert akzeptiert, auch einen kleineren als vorher.</w:t>
+              <w:t>Das Fahrzeug konsequent gekapselt, mit privatem Kilometerstand, Prüfung der gefahrenen Strecke und einem Zeitstempel als Folgeaktion. Anschliessend KI zum Gegencheck eingesetzt mit dem Prompt, ob der Zustand der Klasse von aussen in einen ungültigen Kilometerstand gebracht werden kann.</w:t>
+            </w:r>
+          </w:p>
+        </w:tc>
+        <w:tc>
+          <w:tcPr>
+            <w:tcW w:w="0" w:type="auto"/>
+          </w:tcPr>
+          <w:p>
+            <w:r>
+              <w:t>Der Kilometerstand kann jetzt nur noch wachsen. Ein öffentliches Feld hätte jeden Wert akzeptiert, auch einen kleineren als vorher. Die KI hat im Gegencheck keine Lücke gefunden, dafür die Rückgabe der Transaktionsliste als offene Stelle markiert.</w:t>
             </w:r>
           </w:p>
         </w:tc>
@@ -1378,6 +1378,48 @@
           <w:p>
             <w:r>
               <w:t>P3 ausfüllen und Abgabe prüfen.</w:t>
+            </w:r>
+          </w:p>
+        </w:tc>
+      </w:tr>
+      <w:tr>
+        <w:tc>
+          <w:tcPr>
+            <w:tcW w:w="0" w:type="auto"/>
+          </w:tcPr>
+          <w:p>
+            <w:r>
+              <w:t>07.10.2026</w:t>
+            </w:r>
+          </w:p>
+        </w:tc>
+        <w:tc>
+          <w:tcPr>
+            <w:tcW w:w="0" w:type="auto"/>
+          </w:tcPr>
+          <w:p>
+            <w:r>
+              <w:t>Rückmeldung zu G1 erhalten und auf G2 angewendet: jeden Beleg in P3.1 gegen den Wortlaut des Lernziels geprüft und dort ergänzt, wo er das Ziel nur halb abgedeckt hat.</w:t>
+            </w:r>
+          </w:p>
+        </w:tc>
+        <w:tc>
+          <w:tcPr>
+            <w:tcW w:w="0" w:type="auto"/>
+          </w:tcPr>
+          <w:p>
+            <w:r>
+              <w:t>Bei G1 verwies ein Beleg auf ein verwandtes, aber anderes Thema. Ein Beleg muss das Ziel vollständig treffen, nicht nur ungefähr dazu passen.</w:t>
+            </w:r>
+          </w:p>
+        </w:tc>
+        <w:tc>
+          <w:tcPr>
+            <w:tcW w:w="0" w:type="auto"/>
+          </w:tcPr>
+          <w:p>
+            <w:r>
+              <w:t>Dokument abgeben.</w:t>
             </w:r>
           </w:p>
         </w:tc>
@@ -1637,7 +1679,7 @@
           </w:tcPr>
           <w:p>
             <w:r>
-              <w:t>Ordner Fallbeispiel_Fahrschule. SucheSchueler nimmt einen Namen entgegen und gibt ein Objekt zurück, BerechneHonorar rechnet aus der Dauer den Betrag, Durchfuehren hat keinen Rückgabewert und verändert Kilometerstand und Stundenkonto.</w:t>
+              <w:t>Ordner Fallbeispiel_Fahrschule. SucheSchueler hat den Zugriffstyp public, den Rückgabetyp Fahrschueler, einen Parameter vom Typ string und gibt das Ergebnis mit return zurück. BerechneHonorar rechnet aus der übergebenen Dauer den Betrag, Durchfuehren hat den Rückgabetyp void und verändert Kilometerstand und Stundenkonto. Menüpunkt 1 ruft alle drei auf und zeigt die Wirkung vorher und nachher.</w:t>
             </w:r>
           </w:p>
         </w:tc>
@@ -1670,7 +1712,7 @@
           </w:tcPr>
           <w:p>
             <w:r>
-              <w:t>Fahrschueler, Fahrlehrer, Fahrzeug und Fahrschule haben je zwei Konstruktoren. Der lange ruft den kurzen mit this auf. Menüpunkt 2 erzeugt von jeder Klasse ein Objekt über beide Varianten.</w:t>
+              <w:t>Fahrschueler, Fahrlehrer, Fahrzeug und Fahrschule haben je zwei Konstruktoren, der lange ruft den kurzen mit this auf. Menüpunkt 2 erzeugt von jeder Klasse ein Objekt über beide Varianten. Gegenüber dem Objekt-Initializer aus G1 erzwingt der Konstruktor die Pflichtwerte schon beim Erzeugen, sodass kein halb gefülltes Objekt entstehen kann und die Prüfungen automatisch mitlaufen.</w:t>
             </w:r>
           </w:p>
         </w:tc>
@@ -1702,7 +1744,7 @@
           </w:tcPr>
           <w:p>
             <w:r>
-              <w:t>Klasse Bankkonto mit privatem Saldo und privater Transaktionsliste. Menüpunkt 4 zeigt, dass Beträge von null, negative Beträge und ein zu hoher Bezug abgewiesen werden und der Saldo dabei unverändert bleibt. Im Fallbeispiel ist das Fahrzeug ebenso gekapselt.</w:t>
+              <w:t>Klasse Bankkonto mit privatem Saldo und privater Transaktionsliste. Menüpunkt 4 zeigt, dass ein Betrag von null, ein negativer Betrag und ein zu hoher Bezug abgewiesen werden und der Saldo dabei unverändert bleibt. Menüpunkt 5 benennt das Geheimnis der Klasse Fahrzeug in Worten: der Kilometerstand kann über KilometerFahren nur wachsen, während ein öffentliches Feld jeden Wert angenommen hätte.</w:t>
             </w:r>
           </w:p>
         </w:tc>
@@ -1830,7 +1872,7 @@
           </w:tcPr>
           <w:p>
             <w:r>
-              <w:t>nachher: Luca 4, Kiril 4</w:t>
+              <w:t>nachher: Luca 3, Kiril 4</w:t>
             </w:r>
           </w:p>
         </w:tc>

</xml_diff>